<commit_message>
Mise à jour du résumé (docx et pdf) incluant le lien vers github
</commit_message>
<xml_diff>
--- a/harpe_resume-pres_naturapi.docx
+++ b/harpe_resume-pres_naturapi.docx
@@ -129,7 +129,7 @@
         <w:pStyle w:val="ListParagraph"/>
         <w:numPr>
           <w:ilvl w:val="0"/>
-          <w:numId w:val="4"/>
+          <w:numId w:val="19"/>
         </w:numPr>
         <w:spacing w:lineRule="exact" w:line="250" w:before="0" w:after="36"/>
         <w:rPr/>
@@ -163,7 +163,7 @@
         <w:pStyle w:val="ListParagraph"/>
         <w:numPr>
           <w:ilvl w:val="0"/>
-          <w:numId w:val="5"/>
+          <w:numId w:val="20"/>
         </w:numPr>
         <w:spacing w:lineRule="exact" w:line="250" w:before="0" w:after="36"/>
         <w:rPr/>
@@ -186,7 +186,7 @@
         <w:pStyle w:val="ListParagraph"/>
         <w:numPr>
           <w:ilvl w:val="0"/>
-          <w:numId w:val="6"/>
+          <w:numId w:val="21"/>
         </w:numPr>
         <w:spacing w:lineRule="exact" w:line="250" w:before="0" w:after="36"/>
         <w:rPr/>
@@ -252,7 +252,7 @@
         <w:pStyle w:val="ListParagraph"/>
         <w:numPr>
           <w:ilvl w:val="0"/>
-          <w:numId w:val="7"/>
+          <w:numId w:val="22"/>
         </w:numPr>
         <w:spacing w:lineRule="exact" w:line="250" w:before="0" w:after="36"/>
         <w:rPr/>
@@ -275,7 +275,7 @@
         <w:pStyle w:val="ListParagraph"/>
         <w:numPr>
           <w:ilvl w:val="0"/>
-          <w:numId w:val="8"/>
+          <w:numId w:val="23"/>
         </w:numPr>
         <w:spacing w:lineRule="exact" w:line="250" w:before="0" w:after="36"/>
         <w:rPr/>
@@ -298,7 +298,7 @@
         <w:pStyle w:val="ListParagraph"/>
         <w:numPr>
           <w:ilvl w:val="0"/>
-          <w:numId w:val="9"/>
+          <w:numId w:val="24"/>
         </w:numPr>
         <w:spacing w:lineRule="exact" w:line="250" w:before="0" w:after="36"/>
         <w:rPr/>
@@ -367,8 +367,8 @@
       </w:tblPr>
       <w:tblGrid>
         <w:gridCol w:w="3300"/>
-        <w:gridCol w:w="4058"/>
-        <w:gridCol w:w="2002"/>
+        <w:gridCol w:w="4057"/>
+        <w:gridCol w:w="2003"/>
       </w:tblGrid>
       <w:tr>
         <w:trPr>
@@ -406,7 +406,7 @@
         </w:tc>
         <w:tc>
           <w:tcPr>
-            <w:tcW w:w="4058" w:type="dxa"/>
+            <w:tcW w:w="4057" w:type="dxa"/>
             <w:tcBorders>
               <w:top w:val="single" w:sz="2" w:space="0" w:color="D9D2C4"/>
               <w:left w:val="single" w:sz="2" w:space="0" w:color="D9D2C4"/>
@@ -436,7 +436,7 @@
         </w:tc>
         <w:tc>
           <w:tcPr>
-            <w:tcW w:w="2002" w:type="dxa"/>
+            <w:tcW w:w="2003" w:type="dxa"/>
             <w:tcBorders>
               <w:top w:val="single" w:sz="2" w:space="0" w:color="D9D2C4"/>
               <w:left w:val="single" w:sz="2" w:space="0" w:color="D9D2C4"/>
@@ -499,7 +499,7 @@
         </w:tc>
         <w:tc>
           <w:tcPr>
-            <w:tcW w:w="4058" w:type="dxa"/>
+            <w:tcW w:w="4057" w:type="dxa"/>
             <w:tcBorders>
               <w:top w:val="single" w:sz="2" w:space="0" w:color="D9D2C4"/>
               <w:left w:val="single" w:sz="2" w:space="0" w:color="D9D2C4"/>
@@ -529,7 +529,7 @@
         </w:tc>
         <w:tc>
           <w:tcPr>
-            <w:tcW w:w="2002" w:type="dxa"/>
+            <w:tcW w:w="2003" w:type="dxa"/>
             <w:tcBorders>
               <w:top w:val="single" w:sz="2" w:space="0" w:color="D9D2C4"/>
               <w:left w:val="single" w:sz="2" w:space="0" w:color="D9D2C4"/>
@@ -592,7 +592,7 @@
         </w:tc>
         <w:tc>
           <w:tcPr>
-            <w:tcW w:w="4058" w:type="dxa"/>
+            <w:tcW w:w="4057" w:type="dxa"/>
             <w:tcBorders>
               <w:top w:val="single" w:sz="2" w:space="0" w:color="D9D2C4"/>
               <w:left w:val="single" w:sz="2" w:space="0" w:color="D9D2C4"/>
@@ -622,7 +622,7 @@
         </w:tc>
         <w:tc>
           <w:tcPr>
-            <w:tcW w:w="2002" w:type="dxa"/>
+            <w:tcW w:w="2003" w:type="dxa"/>
             <w:tcBorders>
               <w:top w:val="single" w:sz="2" w:space="0" w:color="D9D2C4"/>
               <w:left w:val="single" w:sz="2" w:space="0" w:color="D9D2C4"/>
@@ -685,7 +685,7 @@
         </w:tc>
         <w:tc>
           <w:tcPr>
-            <w:tcW w:w="4058" w:type="dxa"/>
+            <w:tcW w:w="4057" w:type="dxa"/>
             <w:tcBorders>
               <w:top w:val="single" w:sz="2" w:space="0" w:color="D9D2C4"/>
               <w:left w:val="single" w:sz="2" w:space="0" w:color="D9D2C4"/>
@@ -715,7 +715,7 @@
         </w:tc>
         <w:tc>
           <w:tcPr>
-            <w:tcW w:w="2002" w:type="dxa"/>
+            <w:tcW w:w="2003" w:type="dxa"/>
             <w:tcBorders>
               <w:top w:val="single" w:sz="2" w:space="0" w:color="D9D2C4"/>
               <w:left w:val="single" w:sz="2" w:space="0" w:color="D9D2C4"/>
@@ -802,7 +802,7 @@
         <w:pStyle w:val="ListParagraph"/>
         <w:numPr>
           <w:ilvl w:val="0"/>
-          <w:numId w:val="10"/>
+          <w:numId w:val="25"/>
         </w:numPr>
         <w:spacing w:lineRule="exact" w:line="250" w:before="0" w:after="36"/>
         <w:rPr/>
@@ -825,7 +825,7 @@
         <w:pStyle w:val="ListParagraph"/>
         <w:numPr>
           <w:ilvl w:val="0"/>
-          <w:numId w:val="11"/>
+          <w:numId w:val="26"/>
         </w:numPr>
         <w:spacing w:lineRule="exact" w:line="250" w:before="0" w:after="36"/>
         <w:rPr/>
@@ -848,7 +848,7 @@
         <w:pStyle w:val="ListParagraph"/>
         <w:numPr>
           <w:ilvl w:val="0"/>
-          <w:numId w:val="12"/>
+          <w:numId w:val="27"/>
         </w:numPr>
         <w:spacing w:lineRule="exact" w:line="250" w:before="0" w:after="36"/>
         <w:rPr/>
@@ -871,7 +871,7 @@
         <w:pStyle w:val="ListParagraph"/>
         <w:numPr>
           <w:ilvl w:val="0"/>
-          <w:numId w:val="13"/>
+          <w:numId w:val="28"/>
         </w:numPr>
         <w:spacing w:lineRule="exact" w:line="250" w:before="0" w:after="36"/>
         <w:rPr/>
@@ -894,7 +894,7 @@
         <w:pStyle w:val="ListParagraph"/>
         <w:numPr>
           <w:ilvl w:val="0"/>
-          <w:numId w:val="14"/>
+          <w:numId w:val="29"/>
         </w:numPr>
         <w:spacing w:lineRule="exact" w:line="250" w:before="0" w:after="36"/>
         <w:rPr/>
@@ -917,7 +917,7 @@
         <w:pStyle w:val="ListParagraph"/>
         <w:numPr>
           <w:ilvl w:val="0"/>
-          <w:numId w:val="15"/>
+          <w:numId w:val="30"/>
         </w:numPr>
         <w:spacing w:lineRule="exact" w:line="250" w:before="0" w:after="36"/>
         <w:rPr/>
@@ -1065,7 +1065,7 @@
         <w:pStyle w:val="ListParagraph"/>
         <w:numPr>
           <w:ilvl w:val="0"/>
-          <w:numId w:val="16"/>
+          <w:numId w:val="31"/>
         </w:numPr>
         <w:spacing w:lineRule="exact" w:line="250" w:before="0" w:after="36"/>
         <w:rPr/>
@@ -1088,7 +1088,7 @@
         <w:pStyle w:val="ListParagraph"/>
         <w:numPr>
           <w:ilvl w:val="0"/>
-          <w:numId w:val="17"/>
+          <w:numId w:val="32"/>
         </w:numPr>
         <w:spacing w:lineRule="exact" w:line="250" w:before="0" w:after="36"/>
         <w:rPr/>
@@ -1148,8 +1148,8 @@
       </w:tblPr>
       <w:tblGrid>
         <w:gridCol w:w="1500"/>
-        <w:gridCol w:w="1398"/>
-        <w:gridCol w:w="2155"/>
+        <w:gridCol w:w="1397"/>
+        <w:gridCol w:w="2156"/>
         <w:gridCol w:w="2153"/>
         <w:gridCol w:w="2154"/>
       </w:tblGrid>
@@ -1189,7 +1189,7 @@
         </w:tc>
         <w:tc>
           <w:tcPr>
-            <w:tcW w:w="1398" w:type="dxa"/>
+            <w:tcW w:w="1397" w:type="dxa"/>
             <w:tcBorders>
               <w:top w:val="single" w:sz="2" w:space="0" w:color="D9D2C4"/>
               <w:left w:val="single" w:sz="2" w:space="0" w:color="D9D2C4"/>
@@ -1219,7 +1219,7 @@
         </w:tc>
         <w:tc>
           <w:tcPr>
-            <w:tcW w:w="2155" w:type="dxa"/>
+            <w:tcW w:w="2156" w:type="dxa"/>
             <w:tcBorders>
               <w:top w:val="single" w:sz="2" w:space="0" w:color="D9D2C4"/>
               <w:left w:val="single" w:sz="2" w:space="0" w:color="D9D2C4"/>
@@ -1376,7 +1376,7 @@
         </w:tc>
         <w:tc>
           <w:tcPr>
-            <w:tcW w:w="1398" w:type="dxa"/>
+            <w:tcW w:w="1397" w:type="dxa"/>
             <w:tcBorders>
               <w:top w:val="single" w:sz="2" w:space="0" w:color="D9D2C4"/>
               <w:left w:val="single" w:sz="2" w:space="0" w:color="D9D2C4"/>
@@ -1406,7 +1406,7 @@
         </w:tc>
         <w:tc>
           <w:tcPr>
-            <w:tcW w:w="2155" w:type="dxa"/>
+            <w:tcW w:w="2156" w:type="dxa"/>
             <w:tcBorders>
               <w:top w:val="single" w:sz="2" w:space="0" w:color="D9D2C4"/>
               <w:left w:val="single" w:sz="2" w:space="0" w:color="D9D2C4"/>
@@ -1529,7 +1529,7 @@
         </w:tc>
         <w:tc>
           <w:tcPr>
-            <w:tcW w:w="1398" w:type="dxa"/>
+            <w:tcW w:w="1397" w:type="dxa"/>
             <w:tcBorders>
               <w:top w:val="single" w:sz="2" w:space="0" w:color="D9D2C4"/>
               <w:left w:val="single" w:sz="2" w:space="0" w:color="D9D2C4"/>
@@ -1559,7 +1559,7 @@
         </w:tc>
         <w:tc>
           <w:tcPr>
-            <w:tcW w:w="2155" w:type="dxa"/>
+            <w:tcW w:w="2156" w:type="dxa"/>
             <w:tcBorders>
               <w:top w:val="single" w:sz="2" w:space="0" w:color="D9D2C4"/>
               <w:left w:val="single" w:sz="2" w:space="0" w:color="D9D2C4"/>
@@ -1682,7 +1682,7 @@
         </w:tc>
         <w:tc>
           <w:tcPr>
-            <w:tcW w:w="1398" w:type="dxa"/>
+            <w:tcW w:w="1397" w:type="dxa"/>
             <w:tcBorders>
               <w:top w:val="single" w:sz="2" w:space="0" w:color="D9D2C4"/>
               <w:left w:val="single" w:sz="2" w:space="0" w:color="D9D2C4"/>
@@ -1712,7 +1712,7 @@
         </w:tc>
         <w:tc>
           <w:tcPr>
-            <w:tcW w:w="2155" w:type="dxa"/>
+            <w:tcW w:w="2156" w:type="dxa"/>
             <w:tcBorders>
               <w:top w:val="single" w:sz="2" w:space="0" w:color="D9D2C4"/>
               <w:left w:val="single" w:sz="2" w:space="0" w:color="D9D2C4"/>
@@ -1835,7 +1835,7 @@
         </w:tc>
         <w:tc>
           <w:tcPr>
-            <w:tcW w:w="1398" w:type="dxa"/>
+            <w:tcW w:w="1397" w:type="dxa"/>
             <w:tcBorders>
               <w:top w:val="single" w:sz="2" w:space="0" w:color="D9D2C4"/>
               <w:left w:val="single" w:sz="2" w:space="0" w:color="D9D2C4"/>
@@ -1865,7 +1865,7 @@
         </w:tc>
         <w:tc>
           <w:tcPr>
-            <w:tcW w:w="2155" w:type="dxa"/>
+            <w:tcW w:w="2156" w:type="dxa"/>
             <w:tcBorders>
               <w:top w:val="single" w:sz="2" w:space="0" w:color="D9D2C4"/>
               <w:left w:val="single" w:sz="2" w:space="0" w:color="D9D2C4"/>
@@ -2023,7 +2023,7 @@
         <w:pStyle w:val="ListParagraph"/>
         <w:numPr>
           <w:ilvl w:val="0"/>
-          <w:numId w:val="18"/>
+          <w:numId w:val="33"/>
         </w:numPr>
         <w:spacing w:lineRule="exact" w:line="250" w:before="0" w:after="36"/>
         <w:rPr/>
@@ -2046,7 +2046,7 @@
         <w:pStyle w:val="ListParagraph"/>
         <w:numPr>
           <w:ilvl w:val="0"/>
-          <w:numId w:val="19"/>
+          <w:numId w:val="34"/>
         </w:numPr>
         <w:spacing w:lineRule="exact" w:line="250" w:before="0" w:after="36"/>
         <w:rPr/>
@@ -2069,7 +2069,7 @@
         <w:pStyle w:val="ListParagraph"/>
         <w:numPr>
           <w:ilvl w:val="0"/>
-          <w:numId w:val="20"/>
+          <w:numId w:val="35"/>
         </w:numPr>
         <w:spacing w:lineRule="exact" w:line="250" w:before="0" w:after="36"/>
         <w:rPr/>
@@ -2108,7 +2108,10 @@
         </w:rPr>
       </w:pPr>
       <w:r>
-        <w:rPr/>
+        <w:rPr>
+          <w:b w:val="false"/>
+          <w:bCs w:val="false"/>
+        </w:rPr>
       </w:r>
     </w:p>
     <w:p>
@@ -2248,15 +2251,31 @@
           <w:top w:val="single" w:sz="8" w:space="6" w:color="9C6E12"/>
         </w:pBdr>
         <w:spacing w:lineRule="exact" w:line="252" w:before="120" w:after="0"/>
+        <w:rPr/>
+      </w:pPr>
+      <w:r>
         <w:rPr>
           <w:color w:val="555047"/>
         </w:rPr>
-      </w:pPr>
-      <w:r>
-        <w:rPr>
-          <w:color w:val="555047"/>
-        </w:rPr>
-      </w:r>
+        <w:t xml:space="preserve">Pour accéder au dossier de fabrication complet : </w:t>
+      </w:r>
+      <w:hyperlink r:id="rId3">
+        <w:r>
+          <w:rPr>
+            <w:rStyle w:val="Hyperlink"/>
+            <w:color w:val="555047"/>
+          </w:rPr>
+          <w:t>https://github.com/jn-simonnet/Harpe_frelons</w:t>
+        </w:r>
+      </w:hyperlink>
+      <w:hyperlink r:id="rId4">
+        <w:r>
+          <w:rPr>
+            <w:color w:val="555047"/>
+          </w:rPr>
+          <w:t xml:space="preserve"> </w:t>
+        </w:r>
+      </w:hyperlink>
     </w:p>
     <w:p>
       <w:pPr>
@@ -2309,17 +2328,34 @@
         </w:rPr>
       </w:r>
     </w:p>
+    <w:p>
+      <w:pPr>
+        <w:pStyle w:val="Normal"/>
+        <w:pBdr>
+          <w:top w:val="single" w:sz="8" w:space="6" w:color="9C6E12"/>
+        </w:pBdr>
+        <w:spacing w:lineRule="exact" w:line="252" w:before="120" w:after="0"/>
+        <w:rPr>
+          <w:color w:val="555047"/>
+        </w:rPr>
+      </w:pPr>
+      <w:r>
+        <w:rPr>
+          <w:color w:val="555047"/>
+        </w:rPr>
+      </w:r>
+    </w:p>
     <w:sectPr>
-      <w:footerReference w:type="even" r:id="rId3"/>
-      <w:footerReference w:type="default" r:id="rId4"/>
-      <w:footerReference w:type="first" r:id="rId5"/>
+      <w:footerReference w:type="even" r:id="rId5"/>
+      <w:footerReference w:type="default" r:id="rId6"/>
+      <w:footerReference w:type="first" r:id="rId7"/>
       <w:type w:val="nextPage"/>
       <w:pgSz w:w="12240" w:h="15840"/>
       <w:pgMar w:left="1080" w:right="1080" w:gutter="0" w:header="0" w:top="1080" w:footer="708" w:bottom="1080"/>
       <w:pgNumType w:fmt="decimal"/>
       <w:formProt w:val="false"/>
       <w:textDirection w:val="lrTb"/>
-      <w:docGrid w:type="default" w:linePitch="360" w:charSpace="5938"/>
+      <w:docGrid w:type="default" w:linePitch="360" w:charSpace="5734"/>
     </w:sectPr>
   </w:body>
 </w:document>
@@ -2387,7 +2423,7 @@
     </w:r>
     <w:r>
       <w:rPr/>
-      <w:t>1</w:t>
+      <w:t>3</w:t>
     </w:r>
     <w:r>
       <w:rPr/>
@@ -2469,7 +2505,7 @@
     </w:r>
     <w:r>
       <w:rPr/>
-      <w:t>1</w:t>
+      <w:t>3</w:t>
     </w:r>
     <w:r>
       <w:rPr/>
@@ -2750,6 +2786,1836 @@
     </w:lvl>
   </w:abstractNum>
   <w:abstractNum w:abstractNumId="3">
+    <w:lvl w:ilvl="0">
+      <w:start w:val="1"/>
+      <w:numFmt w:val="bullet"/>
+      <w:lvlText w:val=""/>
+      <w:lvlJc w:val="left"/>
+      <w:pPr>
+        <w:tabs>
+          <w:tab w:val="num" w:pos="0"/>
+        </w:tabs>
+        <w:ind w:left="360" w:hanging="220"/>
+      </w:pPr>
+      <w:rPr>
+        <w:rFonts w:ascii="Symbol" w:hAnsi="Symbol" w:cs="Symbol" w:hint="default"/>
+        <w:color w:val="9C6E12"/>
+      </w:rPr>
+    </w:lvl>
+    <w:lvl w:ilvl="1">
+      <w:start w:val="1"/>
+      <w:numFmt w:val="decimal"/>
+      <w:lvlText w:val="%2."/>
+      <w:lvlJc w:val="left"/>
+      <w:pPr>
+        <w:tabs>
+          <w:tab w:val="num" w:pos="1080"/>
+        </w:tabs>
+        <w:ind w:left="1080" w:hanging="360"/>
+      </w:pPr>
+      <w:rPr/>
+    </w:lvl>
+    <w:lvl w:ilvl="2">
+      <w:start w:val="1"/>
+      <w:numFmt w:val="decimal"/>
+      <w:lvlText w:val="%3."/>
+      <w:lvlJc w:val="left"/>
+      <w:pPr>
+        <w:tabs>
+          <w:tab w:val="num" w:pos="1440"/>
+        </w:tabs>
+        <w:ind w:left="1440" w:hanging="360"/>
+      </w:pPr>
+      <w:rPr/>
+    </w:lvl>
+    <w:lvl w:ilvl="3">
+      <w:start w:val="1"/>
+      <w:numFmt w:val="decimal"/>
+      <w:lvlText w:val="%4."/>
+      <w:lvlJc w:val="left"/>
+      <w:pPr>
+        <w:tabs>
+          <w:tab w:val="num" w:pos="1800"/>
+        </w:tabs>
+        <w:ind w:left="1800" w:hanging="360"/>
+      </w:pPr>
+      <w:rPr/>
+    </w:lvl>
+    <w:lvl w:ilvl="4">
+      <w:start w:val="1"/>
+      <w:numFmt w:val="decimal"/>
+      <w:lvlText w:val="%5."/>
+      <w:lvlJc w:val="left"/>
+      <w:pPr>
+        <w:tabs>
+          <w:tab w:val="num" w:pos="2160"/>
+        </w:tabs>
+        <w:ind w:left="2160" w:hanging="360"/>
+      </w:pPr>
+      <w:rPr/>
+    </w:lvl>
+    <w:lvl w:ilvl="5">
+      <w:start w:val="1"/>
+      <w:numFmt w:val="decimal"/>
+      <w:lvlText w:val="%6."/>
+      <w:lvlJc w:val="left"/>
+      <w:pPr>
+        <w:tabs>
+          <w:tab w:val="num" w:pos="2520"/>
+        </w:tabs>
+        <w:ind w:left="2520" w:hanging="360"/>
+      </w:pPr>
+      <w:rPr/>
+    </w:lvl>
+    <w:lvl w:ilvl="6">
+      <w:start w:val="1"/>
+      <w:numFmt w:val="decimal"/>
+      <w:lvlText w:val="%7."/>
+      <w:lvlJc w:val="left"/>
+      <w:pPr>
+        <w:tabs>
+          <w:tab w:val="num" w:pos="2880"/>
+        </w:tabs>
+        <w:ind w:left="2880" w:hanging="360"/>
+      </w:pPr>
+      <w:rPr/>
+    </w:lvl>
+    <w:lvl w:ilvl="7">
+      <w:start w:val="1"/>
+      <w:numFmt w:val="decimal"/>
+      <w:lvlText w:val="%8."/>
+      <w:lvlJc w:val="left"/>
+      <w:pPr>
+        <w:tabs>
+          <w:tab w:val="num" w:pos="3240"/>
+        </w:tabs>
+        <w:ind w:left="3240" w:hanging="360"/>
+      </w:pPr>
+      <w:rPr/>
+    </w:lvl>
+    <w:lvl w:ilvl="8">
+      <w:start w:val="1"/>
+      <w:numFmt w:val="decimal"/>
+      <w:lvlText w:val="%9."/>
+      <w:lvlJc w:val="left"/>
+      <w:pPr>
+        <w:tabs>
+          <w:tab w:val="num" w:pos="3600"/>
+        </w:tabs>
+        <w:ind w:left="3600" w:hanging="360"/>
+      </w:pPr>
+      <w:rPr/>
+    </w:lvl>
+  </w:abstractNum>
+  <w:abstractNum w:abstractNumId="4">
+    <w:lvl w:ilvl="0">
+      <w:start w:val="1"/>
+      <w:numFmt w:val="bullet"/>
+      <w:lvlText w:val=""/>
+      <w:lvlJc w:val="left"/>
+      <w:pPr>
+        <w:tabs>
+          <w:tab w:val="num" w:pos="0"/>
+        </w:tabs>
+        <w:ind w:left="360" w:hanging="220"/>
+      </w:pPr>
+      <w:rPr>
+        <w:rFonts w:ascii="Symbol" w:hAnsi="Symbol" w:cs="Symbol" w:hint="default"/>
+        <w:color w:val="9C6E12"/>
+      </w:rPr>
+    </w:lvl>
+    <w:lvl w:ilvl="1">
+      <w:start w:val="1"/>
+      <w:numFmt w:val="decimal"/>
+      <w:lvlText w:val="%2."/>
+      <w:lvlJc w:val="left"/>
+      <w:pPr>
+        <w:tabs>
+          <w:tab w:val="num" w:pos="1080"/>
+        </w:tabs>
+        <w:ind w:left="1080" w:hanging="360"/>
+      </w:pPr>
+      <w:rPr/>
+    </w:lvl>
+    <w:lvl w:ilvl="2">
+      <w:start w:val="1"/>
+      <w:numFmt w:val="decimal"/>
+      <w:lvlText w:val="%3."/>
+      <w:lvlJc w:val="left"/>
+      <w:pPr>
+        <w:tabs>
+          <w:tab w:val="num" w:pos="1440"/>
+        </w:tabs>
+        <w:ind w:left="1440" w:hanging="360"/>
+      </w:pPr>
+      <w:rPr/>
+    </w:lvl>
+    <w:lvl w:ilvl="3">
+      <w:start w:val="1"/>
+      <w:numFmt w:val="decimal"/>
+      <w:lvlText w:val="%4."/>
+      <w:lvlJc w:val="left"/>
+      <w:pPr>
+        <w:tabs>
+          <w:tab w:val="num" w:pos="1800"/>
+        </w:tabs>
+        <w:ind w:left="1800" w:hanging="360"/>
+      </w:pPr>
+      <w:rPr/>
+    </w:lvl>
+    <w:lvl w:ilvl="4">
+      <w:start w:val="1"/>
+      <w:numFmt w:val="decimal"/>
+      <w:lvlText w:val="%5."/>
+      <w:lvlJc w:val="left"/>
+      <w:pPr>
+        <w:tabs>
+          <w:tab w:val="num" w:pos="2160"/>
+        </w:tabs>
+        <w:ind w:left="2160" w:hanging="360"/>
+      </w:pPr>
+      <w:rPr/>
+    </w:lvl>
+    <w:lvl w:ilvl="5">
+      <w:start w:val="1"/>
+      <w:numFmt w:val="decimal"/>
+      <w:lvlText w:val="%6."/>
+      <w:lvlJc w:val="left"/>
+      <w:pPr>
+        <w:tabs>
+          <w:tab w:val="num" w:pos="2520"/>
+        </w:tabs>
+        <w:ind w:left="2520" w:hanging="360"/>
+      </w:pPr>
+      <w:rPr/>
+    </w:lvl>
+    <w:lvl w:ilvl="6">
+      <w:start w:val="1"/>
+      <w:numFmt w:val="decimal"/>
+      <w:lvlText w:val="%7."/>
+      <w:lvlJc w:val="left"/>
+      <w:pPr>
+        <w:tabs>
+          <w:tab w:val="num" w:pos="2880"/>
+        </w:tabs>
+        <w:ind w:left="2880" w:hanging="360"/>
+      </w:pPr>
+      <w:rPr/>
+    </w:lvl>
+    <w:lvl w:ilvl="7">
+      <w:start w:val="1"/>
+      <w:numFmt w:val="decimal"/>
+      <w:lvlText w:val="%8."/>
+      <w:lvlJc w:val="left"/>
+      <w:pPr>
+        <w:tabs>
+          <w:tab w:val="num" w:pos="3240"/>
+        </w:tabs>
+        <w:ind w:left="3240" w:hanging="360"/>
+      </w:pPr>
+      <w:rPr/>
+    </w:lvl>
+    <w:lvl w:ilvl="8">
+      <w:start w:val="1"/>
+      <w:numFmt w:val="decimal"/>
+      <w:lvlText w:val="%9."/>
+      <w:lvlJc w:val="left"/>
+      <w:pPr>
+        <w:tabs>
+          <w:tab w:val="num" w:pos="3600"/>
+        </w:tabs>
+        <w:ind w:left="3600" w:hanging="360"/>
+      </w:pPr>
+      <w:rPr/>
+    </w:lvl>
+  </w:abstractNum>
+  <w:abstractNum w:abstractNumId="5">
+    <w:lvl w:ilvl="0">
+      <w:start w:val="1"/>
+      <w:numFmt w:val="bullet"/>
+      <w:lvlText w:val=""/>
+      <w:lvlJc w:val="left"/>
+      <w:pPr>
+        <w:tabs>
+          <w:tab w:val="num" w:pos="0"/>
+        </w:tabs>
+        <w:ind w:left="360" w:hanging="220"/>
+      </w:pPr>
+      <w:rPr>
+        <w:rFonts w:ascii="Symbol" w:hAnsi="Symbol" w:cs="Symbol" w:hint="default"/>
+        <w:color w:val="9C6E12"/>
+      </w:rPr>
+    </w:lvl>
+    <w:lvl w:ilvl="1">
+      <w:start w:val="1"/>
+      <w:numFmt w:val="decimal"/>
+      <w:lvlText w:val="%2."/>
+      <w:lvlJc w:val="left"/>
+      <w:pPr>
+        <w:tabs>
+          <w:tab w:val="num" w:pos="1080"/>
+        </w:tabs>
+        <w:ind w:left="1080" w:hanging="360"/>
+      </w:pPr>
+      <w:rPr/>
+    </w:lvl>
+    <w:lvl w:ilvl="2">
+      <w:start w:val="1"/>
+      <w:numFmt w:val="decimal"/>
+      <w:lvlText w:val="%3."/>
+      <w:lvlJc w:val="left"/>
+      <w:pPr>
+        <w:tabs>
+          <w:tab w:val="num" w:pos="1440"/>
+        </w:tabs>
+        <w:ind w:left="1440" w:hanging="360"/>
+      </w:pPr>
+      <w:rPr/>
+    </w:lvl>
+    <w:lvl w:ilvl="3">
+      <w:start w:val="1"/>
+      <w:numFmt w:val="decimal"/>
+      <w:lvlText w:val="%4."/>
+      <w:lvlJc w:val="left"/>
+      <w:pPr>
+        <w:tabs>
+          <w:tab w:val="num" w:pos="1800"/>
+        </w:tabs>
+        <w:ind w:left="1800" w:hanging="360"/>
+      </w:pPr>
+      <w:rPr/>
+    </w:lvl>
+    <w:lvl w:ilvl="4">
+      <w:start w:val="1"/>
+      <w:numFmt w:val="decimal"/>
+      <w:lvlText w:val="%5."/>
+      <w:lvlJc w:val="left"/>
+      <w:pPr>
+        <w:tabs>
+          <w:tab w:val="num" w:pos="2160"/>
+        </w:tabs>
+        <w:ind w:left="2160" w:hanging="360"/>
+      </w:pPr>
+      <w:rPr/>
+    </w:lvl>
+    <w:lvl w:ilvl="5">
+      <w:start w:val="1"/>
+      <w:numFmt w:val="decimal"/>
+      <w:lvlText w:val="%6."/>
+      <w:lvlJc w:val="left"/>
+      <w:pPr>
+        <w:tabs>
+          <w:tab w:val="num" w:pos="2520"/>
+        </w:tabs>
+        <w:ind w:left="2520" w:hanging="360"/>
+      </w:pPr>
+      <w:rPr/>
+    </w:lvl>
+    <w:lvl w:ilvl="6">
+      <w:start w:val="1"/>
+      <w:numFmt w:val="decimal"/>
+      <w:lvlText w:val="%7."/>
+      <w:lvlJc w:val="left"/>
+      <w:pPr>
+        <w:tabs>
+          <w:tab w:val="num" w:pos="2880"/>
+        </w:tabs>
+        <w:ind w:left="2880" w:hanging="360"/>
+      </w:pPr>
+      <w:rPr/>
+    </w:lvl>
+    <w:lvl w:ilvl="7">
+      <w:start w:val="1"/>
+      <w:numFmt w:val="decimal"/>
+      <w:lvlText w:val="%8."/>
+      <w:lvlJc w:val="left"/>
+      <w:pPr>
+        <w:tabs>
+          <w:tab w:val="num" w:pos="3240"/>
+        </w:tabs>
+        <w:ind w:left="3240" w:hanging="360"/>
+      </w:pPr>
+      <w:rPr/>
+    </w:lvl>
+    <w:lvl w:ilvl="8">
+      <w:start w:val="1"/>
+      <w:numFmt w:val="decimal"/>
+      <w:lvlText w:val="%9."/>
+      <w:lvlJc w:val="left"/>
+      <w:pPr>
+        <w:tabs>
+          <w:tab w:val="num" w:pos="3600"/>
+        </w:tabs>
+        <w:ind w:left="3600" w:hanging="360"/>
+      </w:pPr>
+      <w:rPr/>
+    </w:lvl>
+  </w:abstractNum>
+  <w:abstractNum w:abstractNumId="6">
+    <w:lvl w:ilvl="0">
+      <w:start w:val="1"/>
+      <w:numFmt w:val="bullet"/>
+      <w:lvlText w:val=""/>
+      <w:lvlJc w:val="left"/>
+      <w:pPr>
+        <w:tabs>
+          <w:tab w:val="num" w:pos="0"/>
+        </w:tabs>
+        <w:ind w:left="360" w:hanging="220"/>
+      </w:pPr>
+      <w:rPr>
+        <w:rFonts w:ascii="Symbol" w:hAnsi="Symbol" w:cs="Symbol" w:hint="default"/>
+        <w:color w:val="9C6E12"/>
+      </w:rPr>
+    </w:lvl>
+    <w:lvl w:ilvl="1">
+      <w:start w:val="1"/>
+      <w:numFmt w:val="decimal"/>
+      <w:lvlText w:val="%2."/>
+      <w:lvlJc w:val="left"/>
+      <w:pPr>
+        <w:tabs>
+          <w:tab w:val="num" w:pos="1080"/>
+        </w:tabs>
+        <w:ind w:left="1080" w:hanging="360"/>
+      </w:pPr>
+      <w:rPr/>
+    </w:lvl>
+    <w:lvl w:ilvl="2">
+      <w:start w:val="1"/>
+      <w:numFmt w:val="decimal"/>
+      <w:lvlText w:val="%3."/>
+      <w:lvlJc w:val="left"/>
+      <w:pPr>
+        <w:tabs>
+          <w:tab w:val="num" w:pos="1440"/>
+        </w:tabs>
+        <w:ind w:left="1440" w:hanging="360"/>
+      </w:pPr>
+      <w:rPr/>
+    </w:lvl>
+    <w:lvl w:ilvl="3">
+      <w:start w:val="1"/>
+      <w:numFmt w:val="decimal"/>
+      <w:lvlText w:val="%4."/>
+      <w:lvlJc w:val="left"/>
+      <w:pPr>
+        <w:tabs>
+          <w:tab w:val="num" w:pos="1800"/>
+        </w:tabs>
+        <w:ind w:left="1800" w:hanging="360"/>
+      </w:pPr>
+      <w:rPr/>
+    </w:lvl>
+    <w:lvl w:ilvl="4">
+      <w:start w:val="1"/>
+      <w:numFmt w:val="decimal"/>
+      <w:lvlText w:val="%5."/>
+      <w:lvlJc w:val="left"/>
+      <w:pPr>
+        <w:tabs>
+          <w:tab w:val="num" w:pos="2160"/>
+        </w:tabs>
+        <w:ind w:left="2160" w:hanging="360"/>
+      </w:pPr>
+      <w:rPr/>
+    </w:lvl>
+    <w:lvl w:ilvl="5">
+      <w:start w:val="1"/>
+      <w:numFmt w:val="decimal"/>
+      <w:lvlText w:val="%6."/>
+      <w:lvlJc w:val="left"/>
+      <w:pPr>
+        <w:tabs>
+          <w:tab w:val="num" w:pos="2520"/>
+        </w:tabs>
+        <w:ind w:left="2520" w:hanging="360"/>
+      </w:pPr>
+      <w:rPr/>
+    </w:lvl>
+    <w:lvl w:ilvl="6">
+      <w:start w:val="1"/>
+      <w:numFmt w:val="decimal"/>
+      <w:lvlText w:val="%7."/>
+      <w:lvlJc w:val="left"/>
+      <w:pPr>
+        <w:tabs>
+          <w:tab w:val="num" w:pos="2880"/>
+        </w:tabs>
+        <w:ind w:left="2880" w:hanging="360"/>
+      </w:pPr>
+      <w:rPr/>
+    </w:lvl>
+    <w:lvl w:ilvl="7">
+      <w:start w:val="1"/>
+      <w:numFmt w:val="decimal"/>
+      <w:lvlText w:val="%8."/>
+      <w:lvlJc w:val="left"/>
+      <w:pPr>
+        <w:tabs>
+          <w:tab w:val="num" w:pos="3240"/>
+        </w:tabs>
+        <w:ind w:left="3240" w:hanging="360"/>
+      </w:pPr>
+      <w:rPr/>
+    </w:lvl>
+    <w:lvl w:ilvl="8">
+      <w:start w:val="1"/>
+      <w:numFmt w:val="decimal"/>
+      <w:lvlText w:val="%9."/>
+      <w:lvlJc w:val="left"/>
+      <w:pPr>
+        <w:tabs>
+          <w:tab w:val="num" w:pos="3600"/>
+        </w:tabs>
+        <w:ind w:left="3600" w:hanging="360"/>
+      </w:pPr>
+      <w:rPr/>
+    </w:lvl>
+  </w:abstractNum>
+  <w:abstractNum w:abstractNumId="7">
+    <w:lvl w:ilvl="0">
+      <w:start w:val="1"/>
+      <w:numFmt w:val="bullet"/>
+      <w:lvlText w:val=""/>
+      <w:lvlJc w:val="left"/>
+      <w:pPr>
+        <w:tabs>
+          <w:tab w:val="num" w:pos="0"/>
+        </w:tabs>
+        <w:ind w:left="360" w:hanging="220"/>
+      </w:pPr>
+      <w:rPr>
+        <w:rFonts w:ascii="Symbol" w:hAnsi="Symbol" w:cs="Symbol" w:hint="default"/>
+        <w:color w:val="9C6E12"/>
+      </w:rPr>
+    </w:lvl>
+    <w:lvl w:ilvl="1">
+      <w:start w:val="1"/>
+      <w:numFmt w:val="decimal"/>
+      <w:lvlText w:val="%2."/>
+      <w:lvlJc w:val="left"/>
+      <w:pPr>
+        <w:tabs>
+          <w:tab w:val="num" w:pos="1080"/>
+        </w:tabs>
+        <w:ind w:left="1080" w:hanging="360"/>
+      </w:pPr>
+      <w:rPr/>
+    </w:lvl>
+    <w:lvl w:ilvl="2">
+      <w:start w:val="1"/>
+      <w:numFmt w:val="decimal"/>
+      <w:lvlText w:val="%3."/>
+      <w:lvlJc w:val="left"/>
+      <w:pPr>
+        <w:tabs>
+          <w:tab w:val="num" w:pos="1440"/>
+        </w:tabs>
+        <w:ind w:left="1440" w:hanging="360"/>
+      </w:pPr>
+      <w:rPr/>
+    </w:lvl>
+    <w:lvl w:ilvl="3">
+      <w:start w:val="1"/>
+      <w:numFmt w:val="decimal"/>
+      <w:lvlText w:val="%4."/>
+      <w:lvlJc w:val="left"/>
+      <w:pPr>
+        <w:tabs>
+          <w:tab w:val="num" w:pos="1800"/>
+        </w:tabs>
+        <w:ind w:left="1800" w:hanging="360"/>
+      </w:pPr>
+      <w:rPr/>
+    </w:lvl>
+    <w:lvl w:ilvl="4">
+      <w:start w:val="1"/>
+      <w:numFmt w:val="decimal"/>
+      <w:lvlText w:val="%5."/>
+      <w:lvlJc w:val="left"/>
+      <w:pPr>
+        <w:tabs>
+          <w:tab w:val="num" w:pos="2160"/>
+        </w:tabs>
+        <w:ind w:left="2160" w:hanging="360"/>
+      </w:pPr>
+      <w:rPr/>
+    </w:lvl>
+    <w:lvl w:ilvl="5">
+      <w:start w:val="1"/>
+      <w:numFmt w:val="decimal"/>
+      <w:lvlText w:val="%6."/>
+      <w:lvlJc w:val="left"/>
+      <w:pPr>
+        <w:tabs>
+          <w:tab w:val="num" w:pos="2520"/>
+        </w:tabs>
+        <w:ind w:left="2520" w:hanging="360"/>
+      </w:pPr>
+      <w:rPr/>
+    </w:lvl>
+    <w:lvl w:ilvl="6">
+      <w:start w:val="1"/>
+      <w:numFmt w:val="decimal"/>
+      <w:lvlText w:val="%7."/>
+      <w:lvlJc w:val="left"/>
+      <w:pPr>
+        <w:tabs>
+          <w:tab w:val="num" w:pos="2880"/>
+        </w:tabs>
+        <w:ind w:left="2880" w:hanging="360"/>
+      </w:pPr>
+      <w:rPr/>
+    </w:lvl>
+    <w:lvl w:ilvl="7">
+      <w:start w:val="1"/>
+      <w:numFmt w:val="decimal"/>
+      <w:lvlText w:val="%8."/>
+      <w:lvlJc w:val="left"/>
+      <w:pPr>
+        <w:tabs>
+          <w:tab w:val="num" w:pos="3240"/>
+        </w:tabs>
+        <w:ind w:left="3240" w:hanging="360"/>
+      </w:pPr>
+      <w:rPr/>
+    </w:lvl>
+    <w:lvl w:ilvl="8">
+      <w:start w:val="1"/>
+      <w:numFmt w:val="decimal"/>
+      <w:lvlText w:val="%9."/>
+      <w:lvlJc w:val="left"/>
+      <w:pPr>
+        <w:tabs>
+          <w:tab w:val="num" w:pos="3600"/>
+        </w:tabs>
+        <w:ind w:left="3600" w:hanging="360"/>
+      </w:pPr>
+      <w:rPr/>
+    </w:lvl>
+  </w:abstractNum>
+  <w:abstractNum w:abstractNumId="8">
+    <w:lvl w:ilvl="0">
+      <w:start w:val="1"/>
+      <w:numFmt w:val="bullet"/>
+      <w:lvlText w:val=""/>
+      <w:lvlJc w:val="left"/>
+      <w:pPr>
+        <w:tabs>
+          <w:tab w:val="num" w:pos="0"/>
+        </w:tabs>
+        <w:ind w:left="360" w:hanging="220"/>
+      </w:pPr>
+      <w:rPr>
+        <w:rFonts w:ascii="Symbol" w:hAnsi="Symbol" w:cs="Symbol" w:hint="default"/>
+        <w:color w:val="9C6E12"/>
+      </w:rPr>
+    </w:lvl>
+    <w:lvl w:ilvl="1">
+      <w:start w:val="1"/>
+      <w:numFmt w:val="decimal"/>
+      <w:lvlText w:val="%2."/>
+      <w:lvlJc w:val="left"/>
+      <w:pPr>
+        <w:tabs>
+          <w:tab w:val="num" w:pos="1080"/>
+        </w:tabs>
+        <w:ind w:left="1080" w:hanging="360"/>
+      </w:pPr>
+      <w:rPr/>
+    </w:lvl>
+    <w:lvl w:ilvl="2">
+      <w:start w:val="1"/>
+      <w:numFmt w:val="decimal"/>
+      <w:lvlText w:val="%3."/>
+      <w:lvlJc w:val="left"/>
+      <w:pPr>
+        <w:tabs>
+          <w:tab w:val="num" w:pos="1440"/>
+        </w:tabs>
+        <w:ind w:left="1440" w:hanging="360"/>
+      </w:pPr>
+      <w:rPr/>
+    </w:lvl>
+    <w:lvl w:ilvl="3">
+      <w:start w:val="1"/>
+      <w:numFmt w:val="decimal"/>
+      <w:lvlText w:val="%4."/>
+      <w:lvlJc w:val="left"/>
+      <w:pPr>
+        <w:tabs>
+          <w:tab w:val="num" w:pos="1800"/>
+        </w:tabs>
+        <w:ind w:left="1800" w:hanging="360"/>
+      </w:pPr>
+      <w:rPr/>
+    </w:lvl>
+    <w:lvl w:ilvl="4">
+      <w:start w:val="1"/>
+      <w:numFmt w:val="decimal"/>
+      <w:lvlText w:val="%5."/>
+      <w:lvlJc w:val="left"/>
+      <w:pPr>
+        <w:tabs>
+          <w:tab w:val="num" w:pos="2160"/>
+        </w:tabs>
+        <w:ind w:left="2160" w:hanging="360"/>
+      </w:pPr>
+      <w:rPr/>
+    </w:lvl>
+    <w:lvl w:ilvl="5">
+      <w:start w:val="1"/>
+      <w:numFmt w:val="decimal"/>
+      <w:lvlText w:val="%6."/>
+      <w:lvlJc w:val="left"/>
+      <w:pPr>
+        <w:tabs>
+          <w:tab w:val="num" w:pos="2520"/>
+        </w:tabs>
+        <w:ind w:left="2520" w:hanging="360"/>
+      </w:pPr>
+      <w:rPr/>
+    </w:lvl>
+    <w:lvl w:ilvl="6">
+      <w:start w:val="1"/>
+      <w:numFmt w:val="decimal"/>
+      <w:lvlText w:val="%7."/>
+      <w:lvlJc w:val="left"/>
+      <w:pPr>
+        <w:tabs>
+          <w:tab w:val="num" w:pos="2880"/>
+        </w:tabs>
+        <w:ind w:left="2880" w:hanging="360"/>
+      </w:pPr>
+      <w:rPr/>
+    </w:lvl>
+    <w:lvl w:ilvl="7">
+      <w:start w:val="1"/>
+      <w:numFmt w:val="decimal"/>
+      <w:lvlText w:val="%8."/>
+      <w:lvlJc w:val="left"/>
+      <w:pPr>
+        <w:tabs>
+          <w:tab w:val="num" w:pos="3240"/>
+        </w:tabs>
+        <w:ind w:left="3240" w:hanging="360"/>
+      </w:pPr>
+      <w:rPr/>
+    </w:lvl>
+    <w:lvl w:ilvl="8">
+      <w:start w:val="1"/>
+      <w:numFmt w:val="decimal"/>
+      <w:lvlText w:val="%9."/>
+      <w:lvlJc w:val="left"/>
+      <w:pPr>
+        <w:tabs>
+          <w:tab w:val="num" w:pos="3600"/>
+        </w:tabs>
+        <w:ind w:left="3600" w:hanging="360"/>
+      </w:pPr>
+      <w:rPr/>
+    </w:lvl>
+  </w:abstractNum>
+  <w:abstractNum w:abstractNumId="9">
+    <w:lvl w:ilvl="0">
+      <w:start w:val="1"/>
+      <w:numFmt w:val="bullet"/>
+      <w:lvlText w:val=""/>
+      <w:lvlJc w:val="left"/>
+      <w:pPr>
+        <w:tabs>
+          <w:tab w:val="num" w:pos="0"/>
+        </w:tabs>
+        <w:ind w:left="360" w:hanging="220"/>
+      </w:pPr>
+      <w:rPr>
+        <w:rFonts w:ascii="Symbol" w:hAnsi="Symbol" w:cs="Symbol" w:hint="default"/>
+        <w:color w:val="9C6E12"/>
+      </w:rPr>
+    </w:lvl>
+    <w:lvl w:ilvl="1">
+      <w:start w:val="1"/>
+      <w:numFmt w:val="decimal"/>
+      <w:lvlText w:val="%2."/>
+      <w:lvlJc w:val="left"/>
+      <w:pPr>
+        <w:tabs>
+          <w:tab w:val="num" w:pos="1080"/>
+        </w:tabs>
+        <w:ind w:left="1080" w:hanging="360"/>
+      </w:pPr>
+      <w:rPr/>
+    </w:lvl>
+    <w:lvl w:ilvl="2">
+      <w:start w:val="1"/>
+      <w:numFmt w:val="decimal"/>
+      <w:lvlText w:val="%3."/>
+      <w:lvlJc w:val="left"/>
+      <w:pPr>
+        <w:tabs>
+          <w:tab w:val="num" w:pos="1440"/>
+        </w:tabs>
+        <w:ind w:left="1440" w:hanging="360"/>
+      </w:pPr>
+      <w:rPr/>
+    </w:lvl>
+    <w:lvl w:ilvl="3">
+      <w:start w:val="1"/>
+      <w:numFmt w:val="decimal"/>
+      <w:lvlText w:val="%4."/>
+      <w:lvlJc w:val="left"/>
+      <w:pPr>
+        <w:tabs>
+          <w:tab w:val="num" w:pos="1800"/>
+        </w:tabs>
+        <w:ind w:left="1800" w:hanging="360"/>
+      </w:pPr>
+      <w:rPr/>
+    </w:lvl>
+    <w:lvl w:ilvl="4">
+      <w:start w:val="1"/>
+      <w:numFmt w:val="decimal"/>
+      <w:lvlText w:val="%5."/>
+      <w:lvlJc w:val="left"/>
+      <w:pPr>
+        <w:tabs>
+          <w:tab w:val="num" w:pos="2160"/>
+        </w:tabs>
+        <w:ind w:left="2160" w:hanging="360"/>
+      </w:pPr>
+      <w:rPr/>
+    </w:lvl>
+    <w:lvl w:ilvl="5">
+      <w:start w:val="1"/>
+      <w:numFmt w:val="decimal"/>
+      <w:lvlText w:val="%6."/>
+      <w:lvlJc w:val="left"/>
+      <w:pPr>
+        <w:tabs>
+          <w:tab w:val="num" w:pos="2520"/>
+        </w:tabs>
+        <w:ind w:left="2520" w:hanging="360"/>
+      </w:pPr>
+      <w:rPr/>
+    </w:lvl>
+    <w:lvl w:ilvl="6">
+      <w:start w:val="1"/>
+      <w:numFmt w:val="decimal"/>
+      <w:lvlText w:val="%7."/>
+      <w:lvlJc w:val="left"/>
+      <w:pPr>
+        <w:tabs>
+          <w:tab w:val="num" w:pos="2880"/>
+        </w:tabs>
+        <w:ind w:left="2880" w:hanging="360"/>
+      </w:pPr>
+      <w:rPr/>
+    </w:lvl>
+    <w:lvl w:ilvl="7">
+      <w:start w:val="1"/>
+      <w:numFmt w:val="decimal"/>
+      <w:lvlText w:val="%8."/>
+      <w:lvlJc w:val="left"/>
+      <w:pPr>
+        <w:tabs>
+          <w:tab w:val="num" w:pos="3240"/>
+        </w:tabs>
+        <w:ind w:left="3240" w:hanging="360"/>
+      </w:pPr>
+      <w:rPr/>
+    </w:lvl>
+    <w:lvl w:ilvl="8">
+      <w:start w:val="1"/>
+      <w:numFmt w:val="decimal"/>
+      <w:lvlText w:val="%9."/>
+      <w:lvlJc w:val="left"/>
+      <w:pPr>
+        <w:tabs>
+          <w:tab w:val="num" w:pos="3600"/>
+        </w:tabs>
+        <w:ind w:left="3600" w:hanging="360"/>
+      </w:pPr>
+      <w:rPr/>
+    </w:lvl>
+  </w:abstractNum>
+  <w:abstractNum w:abstractNumId="10">
+    <w:lvl w:ilvl="0">
+      <w:start w:val="1"/>
+      <w:numFmt w:val="bullet"/>
+      <w:lvlText w:val=""/>
+      <w:lvlJc w:val="left"/>
+      <w:pPr>
+        <w:tabs>
+          <w:tab w:val="num" w:pos="0"/>
+        </w:tabs>
+        <w:ind w:left="360" w:hanging="220"/>
+      </w:pPr>
+      <w:rPr>
+        <w:rFonts w:ascii="Symbol" w:hAnsi="Symbol" w:cs="Symbol" w:hint="default"/>
+        <w:color w:val="9C6E12"/>
+      </w:rPr>
+    </w:lvl>
+    <w:lvl w:ilvl="1">
+      <w:start w:val="1"/>
+      <w:numFmt w:val="decimal"/>
+      <w:lvlText w:val="%2."/>
+      <w:lvlJc w:val="left"/>
+      <w:pPr>
+        <w:tabs>
+          <w:tab w:val="num" w:pos="1080"/>
+        </w:tabs>
+        <w:ind w:left="1080" w:hanging="360"/>
+      </w:pPr>
+      <w:rPr/>
+    </w:lvl>
+    <w:lvl w:ilvl="2">
+      <w:start w:val="1"/>
+      <w:numFmt w:val="decimal"/>
+      <w:lvlText w:val="%3."/>
+      <w:lvlJc w:val="left"/>
+      <w:pPr>
+        <w:tabs>
+          <w:tab w:val="num" w:pos="1440"/>
+        </w:tabs>
+        <w:ind w:left="1440" w:hanging="360"/>
+      </w:pPr>
+      <w:rPr/>
+    </w:lvl>
+    <w:lvl w:ilvl="3">
+      <w:start w:val="1"/>
+      <w:numFmt w:val="decimal"/>
+      <w:lvlText w:val="%4."/>
+      <w:lvlJc w:val="left"/>
+      <w:pPr>
+        <w:tabs>
+          <w:tab w:val="num" w:pos="1800"/>
+        </w:tabs>
+        <w:ind w:left="1800" w:hanging="360"/>
+      </w:pPr>
+      <w:rPr/>
+    </w:lvl>
+    <w:lvl w:ilvl="4">
+      <w:start w:val="1"/>
+      <w:numFmt w:val="decimal"/>
+      <w:lvlText w:val="%5."/>
+      <w:lvlJc w:val="left"/>
+      <w:pPr>
+        <w:tabs>
+          <w:tab w:val="num" w:pos="2160"/>
+        </w:tabs>
+        <w:ind w:left="2160" w:hanging="360"/>
+      </w:pPr>
+      <w:rPr/>
+    </w:lvl>
+    <w:lvl w:ilvl="5">
+      <w:start w:val="1"/>
+      <w:numFmt w:val="decimal"/>
+      <w:lvlText w:val="%6."/>
+      <w:lvlJc w:val="left"/>
+      <w:pPr>
+        <w:tabs>
+          <w:tab w:val="num" w:pos="2520"/>
+        </w:tabs>
+        <w:ind w:left="2520" w:hanging="360"/>
+      </w:pPr>
+      <w:rPr/>
+    </w:lvl>
+    <w:lvl w:ilvl="6">
+      <w:start w:val="1"/>
+      <w:numFmt w:val="decimal"/>
+      <w:lvlText w:val="%7."/>
+      <w:lvlJc w:val="left"/>
+      <w:pPr>
+        <w:tabs>
+          <w:tab w:val="num" w:pos="2880"/>
+        </w:tabs>
+        <w:ind w:left="2880" w:hanging="360"/>
+      </w:pPr>
+      <w:rPr/>
+    </w:lvl>
+    <w:lvl w:ilvl="7">
+      <w:start w:val="1"/>
+      <w:numFmt w:val="decimal"/>
+      <w:lvlText w:val="%8."/>
+      <w:lvlJc w:val="left"/>
+      <w:pPr>
+        <w:tabs>
+          <w:tab w:val="num" w:pos="3240"/>
+        </w:tabs>
+        <w:ind w:left="3240" w:hanging="360"/>
+      </w:pPr>
+      <w:rPr/>
+    </w:lvl>
+    <w:lvl w:ilvl="8">
+      <w:start w:val="1"/>
+      <w:numFmt w:val="decimal"/>
+      <w:lvlText w:val="%9."/>
+      <w:lvlJc w:val="left"/>
+      <w:pPr>
+        <w:tabs>
+          <w:tab w:val="num" w:pos="3600"/>
+        </w:tabs>
+        <w:ind w:left="3600" w:hanging="360"/>
+      </w:pPr>
+      <w:rPr/>
+    </w:lvl>
+  </w:abstractNum>
+  <w:abstractNum w:abstractNumId="11">
+    <w:lvl w:ilvl="0">
+      <w:start w:val="1"/>
+      <w:numFmt w:val="bullet"/>
+      <w:lvlText w:val=""/>
+      <w:lvlJc w:val="left"/>
+      <w:pPr>
+        <w:tabs>
+          <w:tab w:val="num" w:pos="0"/>
+        </w:tabs>
+        <w:ind w:left="360" w:hanging="220"/>
+      </w:pPr>
+      <w:rPr>
+        <w:rFonts w:ascii="Symbol" w:hAnsi="Symbol" w:cs="Symbol" w:hint="default"/>
+        <w:color w:val="9C6E12"/>
+      </w:rPr>
+    </w:lvl>
+    <w:lvl w:ilvl="1">
+      <w:start w:val="1"/>
+      <w:numFmt w:val="decimal"/>
+      <w:lvlText w:val="%2."/>
+      <w:lvlJc w:val="left"/>
+      <w:pPr>
+        <w:tabs>
+          <w:tab w:val="num" w:pos="1080"/>
+        </w:tabs>
+        <w:ind w:left="1080" w:hanging="360"/>
+      </w:pPr>
+      <w:rPr/>
+    </w:lvl>
+    <w:lvl w:ilvl="2">
+      <w:start w:val="1"/>
+      <w:numFmt w:val="decimal"/>
+      <w:lvlText w:val="%3."/>
+      <w:lvlJc w:val="left"/>
+      <w:pPr>
+        <w:tabs>
+          <w:tab w:val="num" w:pos="1440"/>
+        </w:tabs>
+        <w:ind w:left="1440" w:hanging="360"/>
+      </w:pPr>
+      <w:rPr/>
+    </w:lvl>
+    <w:lvl w:ilvl="3">
+      <w:start w:val="1"/>
+      <w:numFmt w:val="decimal"/>
+      <w:lvlText w:val="%4."/>
+      <w:lvlJc w:val="left"/>
+      <w:pPr>
+        <w:tabs>
+          <w:tab w:val="num" w:pos="1800"/>
+        </w:tabs>
+        <w:ind w:left="1800" w:hanging="360"/>
+      </w:pPr>
+      <w:rPr/>
+    </w:lvl>
+    <w:lvl w:ilvl="4">
+      <w:start w:val="1"/>
+      <w:numFmt w:val="decimal"/>
+      <w:lvlText w:val="%5."/>
+      <w:lvlJc w:val="left"/>
+      <w:pPr>
+        <w:tabs>
+          <w:tab w:val="num" w:pos="2160"/>
+        </w:tabs>
+        <w:ind w:left="2160" w:hanging="360"/>
+      </w:pPr>
+      <w:rPr/>
+    </w:lvl>
+    <w:lvl w:ilvl="5">
+      <w:start w:val="1"/>
+      <w:numFmt w:val="decimal"/>
+      <w:lvlText w:val="%6."/>
+      <w:lvlJc w:val="left"/>
+      <w:pPr>
+        <w:tabs>
+          <w:tab w:val="num" w:pos="2520"/>
+        </w:tabs>
+        <w:ind w:left="2520" w:hanging="360"/>
+      </w:pPr>
+      <w:rPr/>
+    </w:lvl>
+    <w:lvl w:ilvl="6">
+      <w:start w:val="1"/>
+      <w:numFmt w:val="decimal"/>
+      <w:lvlText w:val="%7."/>
+      <w:lvlJc w:val="left"/>
+      <w:pPr>
+        <w:tabs>
+          <w:tab w:val="num" w:pos="2880"/>
+        </w:tabs>
+        <w:ind w:left="2880" w:hanging="360"/>
+      </w:pPr>
+      <w:rPr/>
+    </w:lvl>
+    <w:lvl w:ilvl="7">
+      <w:start w:val="1"/>
+      <w:numFmt w:val="decimal"/>
+      <w:lvlText w:val="%8."/>
+      <w:lvlJc w:val="left"/>
+      <w:pPr>
+        <w:tabs>
+          <w:tab w:val="num" w:pos="3240"/>
+        </w:tabs>
+        <w:ind w:left="3240" w:hanging="360"/>
+      </w:pPr>
+      <w:rPr/>
+    </w:lvl>
+    <w:lvl w:ilvl="8">
+      <w:start w:val="1"/>
+      <w:numFmt w:val="decimal"/>
+      <w:lvlText w:val="%9."/>
+      <w:lvlJc w:val="left"/>
+      <w:pPr>
+        <w:tabs>
+          <w:tab w:val="num" w:pos="3600"/>
+        </w:tabs>
+        <w:ind w:left="3600" w:hanging="360"/>
+      </w:pPr>
+      <w:rPr/>
+    </w:lvl>
+  </w:abstractNum>
+  <w:abstractNum w:abstractNumId="12">
+    <w:lvl w:ilvl="0">
+      <w:start w:val="1"/>
+      <w:numFmt w:val="bullet"/>
+      <w:lvlText w:val=""/>
+      <w:lvlJc w:val="left"/>
+      <w:pPr>
+        <w:tabs>
+          <w:tab w:val="num" w:pos="0"/>
+        </w:tabs>
+        <w:ind w:left="360" w:hanging="220"/>
+      </w:pPr>
+      <w:rPr>
+        <w:rFonts w:ascii="Symbol" w:hAnsi="Symbol" w:cs="Symbol" w:hint="default"/>
+        <w:color w:val="9C6E12"/>
+      </w:rPr>
+    </w:lvl>
+    <w:lvl w:ilvl="1">
+      <w:start w:val="1"/>
+      <w:numFmt w:val="decimal"/>
+      <w:lvlText w:val="%2."/>
+      <w:lvlJc w:val="left"/>
+      <w:pPr>
+        <w:tabs>
+          <w:tab w:val="num" w:pos="1080"/>
+        </w:tabs>
+        <w:ind w:left="1080" w:hanging="360"/>
+      </w:pPr>
+      <w:rPr/>
+    </w:lvl>
+    <w:lvl w:ilvl="2">
+      <w:start w:val="1"/>
+      <w:numFmt w:val="decimal"/>
+      <w:lvlText w:val="%3."/>
+      <w:lvlJc w:val="left"/>
+      <w:pPr>
+        <w:tabs>
+          <w:tab w:val="num" w:pos="1440"/>
+        </w:tabs>
+        <w:ind w:left="1440" w:hanging="360"/>
+      </w:pPr>
+      <w:rPr/>
+    </w:lvl>
+    <w:lvl w:ilvl="3">
+      <w:start w:val="1"/>
+      <w:numFmt w:val="decimal"/>
+      <w:lvlText w:val="%4."/>
+      <w:lvlJc w:val="left"/>
+      <w:pPr>
+        <w:tabs>
+          <w:tab w:val="num" w:pos="1800"/>
+        </w:tabs>
+        <w:ind w:left="1800" w:hanging="360"/>
+      </w:pPr>
+      <w:rPr/>
+    </w:lvl>
+    <w:lvl w:ilvl="4">
+      <w:start w:val="1"/>
+      <w:numFmt w:val="decimal"/>
+      <w:lvlText w:val="%5."/>
+      <w:lvlJc w:val="left"/>
+      <w:pPr>
+        <w:tabs>
+          <w:tab w:val="num" w:pos="2160"/>
+        </w:tabs>
+        <w:ind w:left="2160" w:hanging="360"/>
+      </w:pPr>
+      <w:rPr/>
+    </w:lvl>
+    <w:lvl w:ilvl="5">
+      <w:start w:val="1"/>
+      <w:numFmt w:val="decimal"/>
+      <w:lvlText w:val="%6."/>
+      <w:lvlJc w:val="left"/>
+      <w:pPr>
+        <w:tabs>
+          <w:tab w:val="num" w:pos="2520"/>
+        </w:tabs>
+        <w:ind w:left="2520" w:hanging="360"/>
+      </w:pPr>
+      <w:rPr/>
+    </w:lvl>
+    <w:lvl w:ilvl="6">
+      <w:start w:val="1"/>
+      <w:numFmt w:val="decimal"/>
+      <w:lvlText w:val="%7."/>
+      <w:lvlJc w:val="left"/>
+      <w:pPr>
+        <w:tabs>
+          <w:tab w:val="num" w:pos="2880"/>
+        </w:tabs>
+        <w:ind w:left="2880" w:hanging="360"/>
+      </w:pPr>
+      <w:rPr/>
+    </w:lvl>
+    <w:lvl w:ilvl="7">
+      <w:start w:val="1"/>
+      <w:numFmt w:val="decimal"/>
+      <w:lvlText w:val="%8."/>
+      <w:lvlJc w:val="left"/>
+      <w:pPr>
+        <w:tabs>
+          <w:tab w:val="num" w:pos="3240"/>
+        </w:tabs>
+        <w:ind w:left="3240" w:hanging="360"/>
+      </w:pPr>
+      <w:rPr/>
+    </w:lvl>
+    <w:lvl w:ilvl="8">
+      <w:start w:val="1"/>
+      <w:numFmt w:val="decimal"/>
+      <w:lvlText w:val="%9."/>
+      <w:lvlJc w:val="left"/>
+      <w:pPr>
+        <w:tabs>
+          <w:tab w:val="num" w:pos="3600"/>
+        </w:tabs>
+        <w:ind w:left="3600" w:hanging="360"/>
+      </w:pPr>
+      <w:rPr/>
+    </w:lvl>
+  </w:abstractNum>
+  <w:abstractNum w:abstractNumId="13">
+    <w:lvl w:ilvl="0">
+      <w:start w:val="1"/>
+      <w:numFmt w:val="bullet"/>
+      <w:lvlText w:val=""/>
+      <w:lvlJc w:val="left"/>
+      <w:pPr>
+        <w:tabs>
+          <w:tab w:val="num" w:pos="0"/>
+        </w:tabs>
+        <w:ind w:left="360" w:hanging="220"/>
+      </w:pPr>
+      <w:rPr>
+        <w:rFonts w:ascii="Symbol" w:hAnsi="Symbol" w:cs="Symbol" w:hint="default"/>
+        <w:color w:val="9C6E12"/>
+      </w:rPr>
+    </w:lvl>
+    <w:lvl w:ilvl="1">
+      <w:start w:val="1"/>
+      <w:numFmt w:val="decimal"/>
+      <w:lvlText w:val="%2."/>
+      <w:lvlJc w:val="left"/>
+      <w:pPr>
+        <w:tabs>
+          <w:tab w:val="num" w:pos="1080"/>
+        </w:tabs>
+        <w:ind w:left="1080" w:hanging="360"/>
+      </w:pPr>
+      <w:rPr/>
+    </w:lvl>
+    <w:lvl w:ilvl="2">
+      <w:start w:val="1"/>
+      <w:numFmt w:val="decimal"/>
+      <w:lvlText w:val="%3."/>
+      <w:lvlJc w:val="left"/>
+      <w:pPr>
+        <w:tabs>
+          <w:tab w:val="num" w:pos="1440"/>
+        </w:tabs>
+        <w:ind w:left="1440" w:hanging="360"/>
+      </w:pPr>
+      <w:rPr/>
+    </w:lvl>
+    <w:lvl w:ilvl="3">
+      <w:start w:val="1"/>
+      <w:numFmt w:val="decimal"/>
+      <w:lvlText w:val="%4."/>
+      <w:lvlJc w:val="left"/>
+      <w:pPr>
+        <w:tabs>
+          <w:tab w:val="num" w:pos="1800"/>
+        </w:tabs>
+        <w:ind w:left="1800" w:hanging="360"/>
+      </w:pPr>
+      <w:rPr/>
+    </w:lvl>
+    <w:lvl w:ilvl="4">
+      <w:start w:val="1"/>
+      <w:numFmt w:val="decimal"/>
+      <w:lvlText w:val="%5."/>
+      <w:lvlJc w:val="left"/>
+      <w:pPr>
+        <w:tabs>
+          <w:tab w:val="num" w:pos="2160"/>
+        </w:tabs>
+        <w:ind w:left="2160" w:hanging="360"/>
+      </w:pPr>
+      <w:rPr/>
+    </w:lvl>
+    <w:lvl w:ilvl="5">
+      <w:start w:val="1"/>
+      <w:numFmt w:val="decimal"/>
+      <w:lvlText w:val="%6."/>
+      <w:lvlJc w:val="left"/>
+      <w:pPr>
+        <w:tabs>
+          <w:tab w:val="num" w:pos="2520"/>
+        </w:tabs>
+        <w:ind w:left="2520" w:hanging="360"/>
+      </w:pPr>
+      <w:rPr/>
+    </w:lvl>
+    <w:lvl w:ilvl="6">
+      <w:start w:val="1"/>
+      <w:numFmt w:val="decimal"/>
+      <w:lvlText w:val="%7."/>
+      <w:lvlJc w:val="left"/>
+      <w:pPr>
+        <w:tabs>
+          <w:tab w:val="num" w:pos="2880"/>
+        </w:tabs>
+        <w:ind w:left="2880" w:hanging="360"/>
+      </w:pPr>
+      <w:rPr/>
+    </w:lvl>
+    <w:lvl w:ilvl="7">
+      <w:start w:val="1"/>
+      <w:numFmt w:val="decimal"/>
+      <w:lvlText w:val="%8."/>
+      <w:lvlJc w:val="left"/>
+      <w:pPr>
+        <w:tabs>
+          <w:tab w:val="num" w:pos="3240"/>
+        </w:tabs>
+        <w:ind w:left="3240" w:hanging="360"/>
+      </w:pPr>
+      <w:rPr/>
+    </w:lvl>
+    <w:lvl w:ilvl="8">
+      <w:start w:val="1"/>
+      <w:numFmt w:val="decimal"/>
+      <w:lvlText w:val="%9."/>
+      <w:lvlJc w:val="left"/>
+      <w:pPr>
+        <w:tabs>
+          <w:tab w:val="num" w:pos="3600"/>
+        </w:tabs>
+        <w:ind w:left="3600" w:hanging="360"/>
+      </w:pPr>
+      <w:rPr/>
+    </w:lvl>
+  </w:abstractNum>
+  <w:abstractNum w:abstractNumId="14">
+    <w:lvl w:ilvl="0">
+      <w:start w:val="1"/>
+      <w:numFmt w:val="bullet"/>
+      <w:lvlText w:val=""/>
+      <w:lvlJc w:val="left"/>
+      <w:pPr>
+        <w:tabs>
+          <w:tab w:val="num" w:pos="0"/>
+        </w:tabs>
+        <w:ind w:left="360" w:hanging="220"/>
+      </w:pPr>
+      <w:rPr>
+        <w:rFonts w:ascii="Symbol" w:hAnsi="Symbol" w:cs="Symbol" w:hint="default"/>
+        <w:color w:val="9C6E12"/>
+      </w:rPr>
+    </w:lvl>
+    <w:lvl w:ilvl="1">
+      <w:start w:val="1"/>
+      <w:numFmt w:val="decimal"/>
+      <w:lvlText w:val="%2."/>
+      <w:lvlJc w:val="left"/>
+      <w:pPr>
+        <w:tabs>
+          <w:tab w:val="num" w:pos="1080"/>
+        </w:tabs>
+        <w:ind w:left="1080" w:hanging="360"/>
+      </w:pPr>
+      <w:rPr/>
+    </w:lvl>
+    <w:lvl w:ilvl="2">
+      <w:start w:val="1"/>
+      <w:numFmt w:val="decimal"/>
+      <w:lvlText w:val="%3."/>
+      <w:lvlJc w:val="left"/>
+      <w:pPr>
+        <w:tabs>
+          <w:tab w:val="num" w:pos="1440"/>
+        </w:tabs>
+        <w:ind w:left="1440" w:hanging="360"/>
+      </w:pPr>
+      <w:rPr/>
+    </w:lvl>
+    <w:lvl w:ilvl="3">
+      <w:start w:val="1"/>
+      <w:numFmt w:val="decimal"/>
+      <w:lvlText w:val="%4."/>
+      <w:lvlJc w:val="left"/>
+      <w:pPr>
+        <w:tabs>
+          <w:tab w:val="num" w:pos="1800"/>
+        </w:tabs>
+        <w:ind w:left="1800" w:hanging="360"/>
+      </w:pPr>
+      <w:rPr/>
+    </w:lvl>
+    <w:lvl w:ilvl="4">
+      <w:start w:val="1"/>
+      <w:numFmt w:val="decimal"/>
+      <w:lvlText w:val="%5."/>
+      <w:lvlJc w:val="left"/>
+      <w:pPr>
+        <w:tabs>
+          <w:tab w:val="num" w:pos="2160"/>
+        </w:tabs>
+        <w:ind w:left="2160" w:hanging="360"/>
+      </w:pPr>
+      <w:rPr/>
+    </w:lvl>
+    <w:lvl w:ilvl="5">
+      <w:start w:val="1"/>
+      <w:numFmt w:val="decimal"/>
+      <w:lvlText w:val="%6."/>
+      <w:lvlJc w:val="left"/>
+      <w:pPr>
+        <w:tabs>
+          <w:tab w:val="num" w:pos="2520"/>
+        </w:tabs>
+        <w:ind w:left="2520" w:hanging="360"/>
+      </w:pPr>
+      <w:rPr/>
+    </w:lvl>
+    <w:lvl w:ilvl="6">
+      <w:start w:val="1"/>
+      <w:numFmt w:val="decimal"/>
+      <w:lvlText w:val="%7."/>
+      <w:lvlJc w:val="left"/>
+      <w:pPr>
+        <w:tabs>
+          <w:tab w:val="num" w:pos="2880"/>
+        </w:tabs>
+        <w:ind w:left="2880" w:hanging="360"/>
+      </w:pPr>
+      <w:rPr/>
+    </w:lvl>
+    <w:lvl w:ilvl="7">
+      <w:start w:val="1"/>
+      <w:numFmt w:val="decimal"/>
+      <w:lvlText w:val="%8."/>
+      <w:lvlJc w:val="left"/>
+      <w:pPr>
+        <w:tabs>
+          <w:tab w:val="num" w:pos="3240"/>
+        </w:tabs>
+        <w:ind w:left="3240" w:hanging="360"/>
+      </w:pPr>
+      <w:rPr/>
+    </w:lvl>
+    <w:lvl w:ilvl="8">
+      <w:start w:val="1"/>
+      <w:numFmt w:val="decimal"/>
+      <w:lvlText w:val="%9."/>
+      <w:lvlJc w:val="left"/>
+      <w:pPr>
+        <w:tabs>
+          <w:tab w:val="num" w:pos="3600"/>
+        </w:tabs>
+        <w:ind w:left="3600" w:hanging="360"/>
+      </w:pPr>
+      <w:rPr/>
+    </w:lvl>
+  </w:abstractNum>
+  <w:abstractNum w:abstractNumId="15">
+    <w:lvl w:ilvl="0">
+      <w:start w:val="1"/>
+      <w:numFmt w:val="bullet"/>
+      <w:lvlText w:val=""/>
+      <w:lvlJc w:val="left"/>
+      <w:pPr>
+        <w:tabs>
+          <w:tab w:val="num" w:pos="0"/>
+        </w:tabs>
+        <w:ind w:left="360" w:hanging="220"/>
+      </w:pPr>
+      <w:rPr>
+        <w:rFonts w:ascii="Symbol" w:hAnsi="Symbol" w:cs="Symbol" w:hint="default"/>
+        <w:color w:val="9C6E12"/>
+      </w:rPr>
+    </w:lvl>
+    <w:lvl w:ilvl="1">
+      <w:start w:val="1"/>
+      <w:numFmt w:val="decimal"/>
+      <w:lvlText w:val="%2."/>
+      <w:lvlJc w:val="left"/>
+      <w:pPr>
+        <w:tabs>
+          <w:tab w:val="num" w:pos="1080"/>
+        </w:tabs>
+        <w:ind w:left="1080" w:hanging="360"/>
+      </w:pPr>
+      <w:rPr/>
+    </w:lvl>
+    <w:lvl w:ilvl="2">
+      <w:start w:val="1"/>
+      <w:numFmt w:val="decimal"/>
+      <w:lvlText w:val="%3."/>
+      <w:lvlJc w:val="left"/>
+      <w:pPr>
+        <w:tabs>
+          <w:tab w:val="num" w:pos="1440"/>
+        </w:tabs>
+        <w:ind w:left="1440" w:hanging="360"/>
+      </w:pPr>
+      <w:rPr/>
+    </w:lvl>
+    <w:lvl w:ilvl="3">
+      <w:start w:val="1"/>
+      <w:numFmt w:val="decimal"/>
+      <w:lvlText w:val="%4."/>
+      <w:lvlJc w:val="left"/>
+      <w:pPr>
+        <w:tabs>
+          <w:tab w:val="num" w:pos="1800"/>
+        </w:tabs>
+        <w:ind w:left="1800" w:hanging="360"/>
+      </w:pPr>
+      <w:rPr/>
+    </w:lvl>
+    <w:lvl w:ilvl="4">
+      <w:start w:val="1"/>
+      <w:numFmt w:val="decimal"/>
+      <w:lvlText w:val="%5."/>
+      <w:lvlJc w:val="left"/>
+      <w:pPr>
+        <w:tabs>
+          <w:tab w:val="num" w:pos="2160"/>
+        </w:tabs>
+        <w:ind w:left="2160" w:hanging="360"/>
+      </w:pPr>
+      <w:rPr/>
+    </w:lvl>
+    <w:lvl w:ilvl="5">
+      <w:start w:val="1"/>
+      <w:numFmt w:val="decimal"/>
+      <w:lvlText w:val="%6."/>
+      <w:lvlJc w:val="left"/>
+      <w:pPr>
+        <w:tabs>
+          <w:tab w:val="num" w:pos="2520"/>
+        </w:tabs>
+        <w:ind w:left="2520" w:hanging="360"/>
+      </w:pPr>
+      <w:rPr/>
+    </w:lvl>
+    <w:lvl w:ilvl="6">
+      <w:start w:val="1"/>
+      <w:numFmt w:val="decimal"/>
+      <w:lvlText w:val="%7."/>
+      <w:lvlJc w:val="left"/>
+      <w:pPr>
+        <w:tabs>
+          <w:tab w:val="num" w:pos="2880"/>
+        </w:tabs>
+        <w:ind w:left="2880" w:hanging="360"/>
+      </w:pPr>
+      <w:rPr/>
+    </w:lvl>
+    <w:lvl w:ilvl="7">
+      <w:start w:val="1"/>
+      <w:numFmt w:val="decimal"/>
+      <w:lvlText w:val="%8."/>
+      <w:lvlJc w:val="left"/>
+      <w:pPr>
+        <w:tabs>
+          <w:tab w:val="num" w:pos="3240"/>
+        </w:tabs>
+        <w:ind w:left="3240" w:hanging="360"/>
+      </w:pPr>
+      <w:rPr/>
+    </w:lvl>
+    <w:lvl w:ilvl="8">
+      <w:start w:val="1"/>
+      <w:numFmt w:val="decimal"/>
+      <w:lvlText w:val="%9."/>
+      <w:lvlJc w:val="left"/>
+      <w:pPr>
+        <w:tabs>
+          <w:tab w:val="num" w:pos="3600"/>
+        </w:tabs>
+        <w:ind w:left="3600" w:hanging="360"/>
+      </w:pPr>
+      <w:rPr/>
+    </w:lvl>
+  </w:abstractNum>
+  <w:abstractNum w:abstractNumId="16">
+    <w:lvl w:ilvl="0">
+      <w:start w:val="1"/>
+      <w:numFmt w:val="bullet"/>
+      <w:lvlText w:val=""/>
+      <w:lvlJc w:val="left"/>
+      <w:pPr>
+        <w:tabs>
+          <w:tab w:val="num" w:pos="0"/>
+        </w:tabs>
+        <w:ind w:left="360" w:hanging="220"/>
+      </w:pPr>
+      <w:rPr>
+        <w:rFonts w:ascii="Symbol" w:hAnsi="Symbol" w:cs="Symbol" w:hint="default"/>
+        <w:color w:val="9C6E12"/>
+      </w:rPr>
+    </w:lvl>
+    <w:lvl w:ilvl="1">
+      <w:start w:val="1"/>
+      <w:numFmt w:val="decimal"/>
+      <w:lvlText w:val="%2."/>
+      <w:lvlJc w:val="left"/>
+      <w:pPr>
+        <w:tabs>
+          <w:tab w:val="num" w:pos="1080"/>
+        </w:tabs>
+        <w:ind w:left="1080" w:hanging="360"/>
+      </w:pPr>
+      <w:rPr/>
+    </w:lvl>
+    <w:lvl w:ilvl="2">
+      <w:start w:val="1"/>
+      <w:numFmt w:val="decimal"/>
+      <w:lvlText w:val="%3."/>
+      <w:lvlJc w:val="left"/>
+      <w:pPr>
+        <w:tabs>
+          <w:tab w:val="num" w:pos="1440"/>
+        </w:tabs>
+        <w:ind w:left="1440" w:hanging="360"/>
+      </w:pPr>
+      <w:rPr/>
+    </w:lvl>
+    <w:lvl w:ilvl="3">
+      <w:start w:val="1"/>
+      <w:numFmt w:val="decimal"/>
+      <w:lvlText w:val="%4."/>
+      <w:lvlJc w:val="left"/>
+      <w:pPr>
+        <w:tabs>
+          <w:tab w:val="num" w:pos="1800"/>
+        </w:tabs>
+        <w:ind w:left="1800" w:hanging="360"/>
+      </w:pPr>
+      <w:rPr/>
+    </w:lvl>
+    <w:lvl w:ilvl="4">
+      <w:start w:val="1"/>
+      <w:numFmt w:val="decimal"/>
+      <w:lvlText w:val="%5."/>
+      <w:lvlJc w:val="left"/>
+      <w:pPr>
+        <w:tabs>
+          <w:tab w:val="num" w:pos="2160"/>
+        </w:tabs>
+        <w:ind w:left="2160" w:hanging="360"/>
+      </w:pPr>
+      <w:rPr/>
+    </w:lvl>
+    <w:lvl w:ilvl="5">
+      <w:start w:val="1"/>
+      <w:numFmt w:val="decimal"/>
+      <w:lvlText w:val="%6."/>
+      <w:lvlJc w:val="left"/>
+      <w:pPr>
+        <w:tabs>
+          <w:tab w:val="num" w:pos="2520"/>
+        </w:tabs>
+        <w:ind w:left="2520" w:hanging="360"/>
+      </w:pPr>
+      <w:rPr/>
+    </w:lvl>
+    <w:lvl w:ilvl="6">
+      <w:start w:val="1"/>
+      <w:numFmt w:val="decimal"/>
+      <w:lvlText w:val="%7."/>
+      <w:lvlJc w:val="left"/>
+      <w:pPr>
+        <w:tabs>
+          <w:tab w:val="num" w:pos="2880"/>
+        </w:tabs>
+        <w:ind w:left="2880" w:hanging="360"/>
+      </w:pPr>
+      <w:rPr/>
+    </w:lvl>
+    <w:lvl w:ilvl="7">
+      <w:start w:val="1"/>
+      <w:numFmt w:val="decimal"/>
+      <w:lvlText w:val="%8."/>
+      <w:lvlJc w:val="left"/>
+      <w:pPr>
+        <w:tabs>
+          <w:tab w:val="num" w:pos="3240"/>
+        </w:tabs>
+        <w:ind w:left="3240" w:hanging="360"/>
+      </w:pPr>
+      <w:rPr/>
+    </w:lvl>
+    <w:lvl w:ilvl="8">
+      <w:start w:val="1"/>
+      <w:numFmt w:val="decimal"/>
+      <w:lvlText w:val="%9."/>
+      <w:lvlJc w:val="left"/>
+      <w:pPr>
+        <w:tabs>
+          <w:tab w:val="num" w:pos="3600"/>
+        </w:tabs>
+        <w:ind w:left="3600" w:hanging="360"/>
+      </w:pPr>
+      <w:rPr/>
+    </w:lvl>
+  </w:abstractNum>
+  <w:abstractNum w:abstractNumId="17">
+    <w:lvl w:ilvl="0">
+      <w:start w:val="1"/>
+      <w:numFmt w:val="bullet"/>
+      <w:lvlText w:val=""/>
+      <w:lvlJc w:val="left"/>
+      <w:pPr>
+        <w:tabs>
+          <w:tab w:val="num" w:pos="0"/>
+        </w:tabs>
+        <w:ind w:left="360" w:hanging="220"/>
+      </w:pPr>
+      <w:rPr>
+        <w:rFonts w:ascii="Symbol" w:hAnsi="Symbol" w:cs="Symbol" w:hint="default"/>
+        <w:color w:val="9C6E12"/>
+      </w:rPr>
+    </w:lvl>
+    <w:lvl w:ilvl="1">
+      <w:start w:val="1"/>
+      <w:numFmt w:val="decimal"/>
+      <w:lvlText w:val="%2."/>
+      <w:lvlJc w:val="left"/>
+      <w:pPr>
+        <w:tabs>
+          <w:tab w:val="num" w:pos="1080"/>
+        </w:tabs>
+        <w:ind w:left="1080" w:hanging="360"/>
+      </w:pPr>
+      <w:rPr/>
+    </w:lvl>
+    <w:lvl w:ilvl="2">
+      <w:start w:val="1"/>
+      <w:numFmt w:val="decimal"/>
+      <w:lvlText w:val="%3."/>
+      <w:lvlJc w:val="left"/>
+      <w:pPr>
+        <w:tabs>
+          <w:tab w:val="num" w:pos="1440"/>
+        </w:tabs>
+        <w:ind w:left="1440" w:hanging="360"/>
+      </w:pPr>
+      <w:rPr/>
+    </w:lvl>
+    <w:lvl w:ilvl="3">
+      <w:start w:val="1"/>
+      <w:numFmt w:val="decimal"/>
+      <w:lvlText w:val="%4."/>
+      <w:lvlJc w:val="left"/>
+      <w:pPr>
+        <w:tabs>
+          <w:tab w:val="num" w:pos="1800"/>
+        </w:tabs>
+        <w:ind w:left="1800" w:hanging="360"/>
+      </w:pPr>
+      <w:rPr/>
+    </w:lvl>
+    <w:lvl w:ilvl="4">
+      <w:start w:val="1"/>
+      <w:numFmt w:val="decimal"/>
+      <w:lvlText w:val="%5."/>
+      <w:lvlJc w:val="left"/>
+      <w:pPr>
+        <w:tabs>
+          <w:tab w:val="num" w:pos="2160"/>
+        </w:tabs>
+        <w:ind w:left="2160" w:hanging="360"/>
+      </w:pPr>
+      <w:rPr/>
+    </w:lvl>
+    <w:lvl w:ilvl="5">
+      <w:start w:val="1"/>
+      <w:numFmt w:val="decimal"/>
+      <w:lvlText w:val="%6."/>
+      <w:lvlJc w:val="left"/>
+      <w:pPr>
+        <w:tabs>
+          <w:tab w:val="num" w:pos="2520"/>
+        </w:tabs>
+        <w:ind w:left="2520" w:hanging="360"/>
+      </w:pPr>
+      <w:rPr/>
+    </w:lvl>
+    <w:lvl w:ilvl="6">
+      <w:start w:val="1"/>
+      <w:numFmt w:val="decimal"/>
+      <w:lvlText w:val="%7."/>
+      <w:lvlJc w:val="left"/>
+      <w:pPr>
+        <w:tabs>
+          <w:tab w:val="num" w:pos="2880"/>
+        </w:tabs>
+        <w:ind w:left="2880" w:hanging="360"/>
+      </w:pPr>
+      <w:rPr/>
+    </w:lvl>
+    <w:lvl w:ilvl="7">
+      <w:start w:val="1"/>
+      <w:numFmt w:val="decimal"/>
+      <w:lvlText w:val="%8."/>
+      <w:lvlJc w:val="left"/>
+      <w:pPr>
+        <w:tabs>
+          <w:tab w:val="num" w:pos="3240"/>
+        </w:tabs>
+        <w:ind w:left="3240" w:hanging="360"/>
+      </w:pPr>
+      <w:rPr/>
+    </w:lvl>
+    <w:lvl w:ilvl="8">
+      <w:start w:val="1"/>
+      <w:numFmt w:val="decimal"/>
+      <w:lvlText w:val="%9."/>
+      <w:lvlJc w:val="left"/>
+      <w:pPr>
+        <w:tabs>
+          <w:tab w:val="num" w:pos="3600"/>
+        </w:tabs>
+        <w:ind w:left="3600" w:hanging="360"/>
+      </w:pPr>
+      <w:rPr/>
+    </w:lvl>
+  </w:abstractNum>
+  <w:abstractNum w:abstractNumId="18">
     <w:lvl w:ilvl="0">
       <w:start w:val="1"/>
       <w:numFmt w:val="none"/>
@@ -2878,58 +4744,103 @@
     <w:abstractNumId w:val="3"/>
   </w:num>
   <w:num w:numId="4">
-    <w:abstractNumId w:val="2"/>
+    <w:abstractNumId w:val="4"/>
+  </w:num>
+  <w:num w:numId="5">
+    <w:abstractNumId w:val="5"/>
+  </w:num>
+  <w:num w:numId="6">
+    <w:abstractNumId w:val="6"/>
+  </w:num>
+  <w:num w:numId="7">
+    <w:abstractNumId w:val="7"/>
+  </w:num>
+  <w:num w:numId="8">
+    <w:abstractNumId w:val="8"/>
+  </w:num>
+  <w:num w:numId="9">
+    <w:abstractNumId w:val="9"/>
+  </w:num>
+  <w:num w:numId="10">
+    <w:abstractNumId w:val="10"/>
+  </w:num>
+  <w:num w:numId="11">
+    <w:abstractNumId w:val="11"/>
+  </w:num>
+  <w:num w:numId="12">
+    <w:abstractNumId w:val="12"/>
+  </w:num>
+  <w:num w:numId="13">
+    <w:abstractNumId w:val="13"/>
+  </w:num>
+  <w:num w:numId="14">
+    <w:abstractNumId w:val="14"/>
+  </w:num>
+  <w:num w:numId="15">
+    <w:abstractNumId w:val="15"/>
+  </w:num>
+  <w:num w:numId="16">
+    <w:abstractNumId w:val="16"/>
+  </w:num>
+  <w:num w:numId="17">
+    <w:abstractNumId w:val="17"/>
+  </w:num>
+  <w:num w:numId="18">
+    <w:abstractNumId w:val="18"/>
+  </w:num>
+  <w:num w:numId="19">
+    <w:abstractNumId w:val="1"/>
     <w:lvlOverride w:ilvl="0">
       <w:startOverride w:val="1"/>
     </w:lvlOverride>
   </w:num>
-  <w:num w:numId="5">
-    <w:abstractNumId w:val="2"/>
+  <w:num w:numId="20">
+    <w:abstractNumId w:val="1"/>
   </w:num>
-  <w:num w:numId="6">
-    <w:abstractNumId w:val="2"/>
+  <w:num w:numId="21">
+    <w:abstractNumId w:val="1"/>
   </w:num>
-  <w:num w:numId="7">
-    <w:abstractNumId w:val="2"/>
+  <w:num w:numId="22">
+    <w:abstractNumId w:val="1"/>
   </w:num>
-  <w:num w:numId="8">
-    <w:abstractNumId w:val="2"/>
+  <w:num w:numId="23">
+    <w:abstractNumId w:val="1"/>
   </w:num>
-  <w:num w:numId="9">
-    <w:abstractNumId w:val="2"/>
+  <w:num w:numId="24">
+    <w:abstractNumId w:val="1"/>
   </w:num>
-  <w:num w:numId="10">
-    <w:abstractNumId w:val="2"/>
+  <w:num w:numId="25">
+    <w:abstractNumId w:val="1"/>
   </w:num>
-  <w:num w:numId="11">
-    <w:abstractNumId w:val="2"/>
+  <w:num w:numId="26">
+    <w:abstractNumId w:val="1"/>
   </w:num>
-  <w:num w:numId="12">
-    <w:abstractNumId w:val="2"/>
+  <w:num w:numId="27">
+    <w:abstractNumId w:val="1"/>
   </w:num>
-  <w:num w:numId="13">
-    <w:abstractNumId w:val="2"/>
+  <w:num w:numId="28">
+    <w:abstractNumId w:val="1"/>
   </w:num>
-  <w:num w:numId="14">
-    <w:abstractNumId w:val="2"/>
+  <w:num w:numId="29">
+    <w:abstractNumId w:val="1"/>
   </w:num>
-  <w:num w:numId="15">
-    <w:abstractNumId w:val="2"/>
+  <w:num w:numId="30">
+    <w:abstractNumId w:val="1"/>
   </w:num>
-  <w:num w:numId="16">
-    <w:abstractNumId w:val="2"/>
+  <w:num w:numId="31">
+    <w:abstractNumId w:val="1"/>
   </w:num>
-  <w:num w:numId="17">
-    <w:abstractNumId w:val="2"/>
+  <w:num w:numId="32">
+    <w:abstractNumId w:val="1"/>
   </w:num>
-  <w:num w:numId="18">
-    <w:abstractNumId w:val="2"/>
+  <w:num w:numId="33">
+    <w:abstractNumId w:val="1"/>
   </w:num>
-  <w:num w:numId="19">
-    <w:abstractNumId w:val="2"/>
+  <w:num w:numId="34">
+    <w:abstractNumId w:val="1"/>
   </w:num>
-  <w:num w:numId="20">
-    <w:abstractNumId w:val="2"/>
+  <w:num w:numId="35">
+    <w:abstractNumId w:val="1"/>
   </w:num>
 </w:numbering>
 </file>

</xml_diff>